<commit_message>
Regenerate resume PDF+DOCX (Moovn current; Ignite Energy Access dates) via app generators — theme unchanged
</commit_message>
<xml_diff>
--- a/public/Eric_Gitangu_Resume.docx
+++ b/public/Eric_Gitangu_Resume.docx
@@ -41,7 +41,7 @@
         </w:rPr>
         <w:t xml:space="preserve">Nairobi, Kenya · </w:t>
       </w:r>
-      <w:hyperlink w:history="1" r:id="rIdeqac8zhmktsypsq1ozwwy">
+      <w:hyperlink w:history="1" r:id="rIdsm3nfhsfhfnlnveaxezhg">
         <w:r>
           <w:rPr>
             <w:color w:val="1A4EA3"/>
@@ -60,7 +60,7 @@
         </w:rPr>
         <w:t xml:space="preserve"> · +254 708 078 997 · </w:t>
       </w:r>
-      <w:hyperlink w:history="1" r:id="rId9iwqikaqscidmxwf93b_b">
+      <w:hyperlink w:history="1" r:id="rId7vggytcdv3rzyqrzhu7vp">
         <w:r>
           <w:rPr>
             <w:color w:val="1A4EA3"/>
@@ -79,7 +79,7 @@
         </w:rPr>
         <w:t xml:space="preserve"> · </w:t>
       </w:r>
-      <w:hyperlink w:history="1" r:id="rId8ylr2fun5-k-w36ap5tgw">
+      <w:hyperlink w:history="1" r:id="rId4a6w5k7uiz-x8v17amdwu">
         <w:r>
           <w:rPr>
             <w:color w:val="1A4EA3"/>
@@ -118,7 +118,7 @@
           <w:sz w:val="19"/>
           <w:szCs w:val="19"/>
         </w:rPr>
-        <w:t xml:space="preserve">Software Engineering Lead and Architect with 10+ years shipping event-driven distributed systems across healthcare ML, fintech, energy access, and government-scale infrastructure. Deep expertise in CQRS, event sourcing, hexagonal/ports-and-adapters, and saga orchestration — applied at Vishnu Systems (ML security for SiMD/SaMD medical devices), Ignite/ENGIE Energy Access (PAYG solar across 7 African markets), Baw Bab Technologies (digital addressing for 2.3M Nairobi residents), and Unicorns (multi-tenant SaaS super-app). Polyglot across Python, Java, Rust, TypeScript, Go, Kotlin, Swift, and Clojure. Founded Deveric mentorship initiative (15+ engineers mentored) and hold 80+ validated technical certifications.</w:t>
+        <w:t xml:space="preserve">Software Engineering Lead and Architect with 10+ years shipping event-driven distributed systems across healthcare ML, fintech, energy access, and government-scale infrastructure. Deep expertise in CQRS, event sourcing, hexagonal/ports-and-adapters, and saga orchestration — applied at Moovn Technologies (current — Senior Full Stack Engineer, Platform Architecture &amp; Security across mobility, fintech &amp; logistics), Vishnu Systems (ML security for SiMD/SaMD medical devices), Ignite Energy Access (PAYG solar platform reliability across 7 African markets), Baw Bab Technologies (digital addressing for 2.3M Nairobi residents), and Unicorns (multi-tenant SaaS super-app). Polyglot across Python, Java, C#, Rust, TypeScript, Go, Kotlin, Swift, and Clojure — with hands-on .NET 10 / ASP.NET Core fintech work (PesaCore) bridging the .NET 4.5 / Windows Server era at Veracode to the modern LTS ecosystem. Founded Deveric mentorship initiative (15+ engineers mentored) and hold 80+ validated technical certifications.</w:t>
       </w:r>
     </w:p>
     <w:p>
@@ -150,14 +150,7 @@
           <w:sz w:val="21"/>
           <w:szCs w:val="21"/>
         </w:rPr>
-        <w:t xml:space="preserve">Team Lead — QA &amp; Engineering (SDET &amp; Platform) — Ignite Energy Access</w:t>
-      </w:r>
-      <w:r>
-        <w:rPr>
-          <w:sz w:val="21"/>
-          <w:szCs w:val="21"/>
-        </w:rPr>
-        <w:t xml:space="preserve"> (formerly ENGIE Energy Access)</w:t>
+        <w:t xml:space="preserve">Senior Full Stack Engineer — Platform Architecture &amp; Security — Moovn Technologies (moovn.com)</w:t>
       </w:r>
       <w:r>
         <w:rPr>
@@ -165,7 +158,151 @@
           <w:sz w:val="18"/>
           <w:szCs w:val="18"/>
         </w:rPr>
-        <w:t xml:space="preserve">   May 2025 – Present · Nairobi, Kenya</w:t>
+        <w:t xml:space="preserve">   Jan 2026 – Present · Nairobi, Kenya</w:t>
+      </w:r>
+    </w:p>
+    <w:p>
+      <w:pPr>
+        <w:spacing w:after="60"/>
+      </w:pPr>
+      <w:r>
+        <w:rPr>
+          <w:i/>
+          <w:iCs/>
+          <w:sz w:val="19"/>
+          <w:szCs w:val="19"/>
+        </w:rPr>
+        <w:t xml:space="preserve">Architecting and scaling Moovn's global platform across mobility, logistics, fintech, and digital commerce (Seattle-HQ'd, emerging-market focus). Full-stack delivery with ownership of platform architecture, payments infrastructure, and data security.</w:t>
+      </w:r>
+    </w:p>
+    <w:p>
+      <w:pPr>
+        <w:pStyle w:val="ListParagraph"/>
+        <w:numPr>
+          <w:ilvl w:val="0"/>
+          <w:numId w:val="1"/>
+        </w:numPr>
+        <w:spacing w:after="30"/>
+      </w:pPr>
+      <w:r>
+        <w:rPr>
+          <w:sz w:val="19"/>
+          <w:szCs w:val="19"/>
+        </w:rPr>
+        <w:t xml:space="preserve">Design and build scalable backend services, RESTful APIs, and distributed systems powering mobility, payments, and last-mile logistics; modernize existing PHP/CodeIgniter systems toward a cloud-native, next-generation architecture</w:t>
+      </w:r>
+    </w:p>
+    <w:p>
+      <w:pPr>
+        <w:pStyle w:val="ListParagraph"/>
+        <w:numPr>
+          <w:ilvl w:val="0"/>
+          <w:numId w:val="1"/>
+        </w:numPr>
+        <w:spacing w:after="30"/>
+      </w:pPr>
+      <w:r>
+        <w:rPr>
+          <w:sz w:val="19"/>
+          <w:szCs w:val="19"/>
+        </w:rPr>
+        <w:t xml:space="preserve">Lead fintech &amp; payment integrations — payment orchestration, settlement, reconciliation, and transaction processing across banking APIs, mobile money operators, Mastercard MPGS, and Stripe — with PCI DSS-aligned secure payment workflows</w:t>
+      </w:r>
+    </w:p>
+    <w:p>
+      <w:pPr>
+        <w:pStyle w:val="ListParagraph"/>
+        <w:numPr>
+          <w:ilvl w:val="0"/>
+          <w:numId w:val="1"/>
+        </w:numPr>
+        <w:spacing w:after="30"/>
+      </w:pPr>
+      <w:r>
+        <w:rPr>
+          <w:sz w:val="19"/>
+          <w:szCs w:val="19"/>
+        </w:rPr>
+        <w:t xml:space="preserve">Own application &amp; data security: OAuth2 / OpenID Connect / JWT auth frameworks, encryption, IAM, and OWASP-aligned secure-by-default practices, including security reviews and penetration-test remediation</w:t>
+      </w:r>
+    </w:p>
+    <w:p>
+      <w:pPr>
+        <w:pStyle w:val="ListParagraph"/>
+        <w:numPr>
+          <w:ilvl w:val="0"/>
+          <w:numId w:val="1"/>
+        </w:numPr>
+        <w:spacing w:after="30"/>
+      </w:pPr>
+      <w:r>
+        <w:rPr>
+          <w:sz w:val="19"/>
+          <w:szCs w:val="19"/>
+        </w:rPr>
+        <w:t xml:space="preserve">Run cloud, DevOps &amp; network engineering — Docker/Kubernetes, Terraform IaC across AWS/Azure/GCP, CI/CD pipelines, observability, and hardened Linux + Nginx/Apache high-availability production environments</w:t>
+      </w:r>
+    </w:p>
+    <w:p>
+      <w:pPr>
+        <w:pStyle w:val="ListParagraph"/>
+        <w:numPr>
+          <w:ilvl w:val="0"/>
+          <w:numId w:val="1"/>
+        </w:numPr>
+        <w:spacing w:after="30"/>
+      </w:pPr>
+      <w:r>
+        <w:rPr>
+          <w:sz w:val="19"/>
+          <w:szCs w:val="19"/>
+        </w:rPr>
+        <w:t xml:space="preserve">Provide architectural guidance across engineering initiatives and mentor engineers through code reviews; contribute to long-term platform strategy with executive leadership</w:t>
+      </w:r>
+    </w:p>
+    <w:p>
+      <w:pPr>
+        <w:spacing w:after="80"/>
+      </w:pPr>
+      <w:r>
+        <w:rPr>
+          <w:b/>
+          <w:bCs/>
+          <w:color w:val="555555"/>
+          <w:sz w:val="17"/>
+          <w:szCs w:val="17"/>
+        </w:rPr>
+        <w:t xml:space="preserve">Stack: </w:t>
+      </w:r>
+      <w:r>
+        <w:rPr>
+          <w:color w:val="1A4EA3"/>
+          <w:sz w:val="17"/>
+          <w:szCs w:val="17"/>
+        </w:rPr>
+        <w:t xml:space="preserve">PHP · CodeIgniter · Node.js · TypeScript · Python · Go · React · Next.js · Vue.js · Tailwind CSS · MySQL · PostgreSQL · MongoDB · Redis · Elasticsearch · Linux · Nginx · Apache · Docker · Kubernetes · Terraform · AWS · Azure · GCP · OAuth2 · JWT · PCI DSS · OWASP · Mastercard MPGS · Stripe · Mobile Money · Banking APIs</w:t>
+      </w:r>
+    </w:p>
+    <w:p>
+      <w:pPr>
+        <w:spacing w:before="120" w:after="30"/>
+      </w:pPr>
+      <w:r>
+        <w:rPr>
+          <w:b/>
+          <w:bCs/>
+          <w:sz w:val="21"/>
+          <w:szCs w:val="21"/>
+        </w:rPr>
+        <w:t xml:space="preserve">Software Engineering Lead / Architect — QA &amp; Platform — Ignite Energy Access</w:t>
+      </w:r>
+      <w:r>
+        <w:rPr>
+          <w:color w:val="555555"/>
+          <w:sz w:val="18"/>
+          <w:szCs w:val="18"/>
+        </w:rPr>
+        <w:t xml:space="preserve">   May 2025 – Jan 2026 · Nairobi, Kenya</w:t>
       </w:r>
     </w:p>
     <w:p>
@@ -1361,7 +1498,7 @@
           <w:sz w:val="21"/>
           <w:szCs w:val="21"/>
         </w:rPr>
-        <w:t xml:space="preserve">PawaCloud Assistant — AI Cloud Advisor</w:t>
+        <w:t xml:space="preserve">PesaCore — .NET 10 Cloud-Native Banking Platform</w:t>
       </w:r>
       <w:r>
         <w:rPr>
@@ -1370,7 +1507,7 @@
         </w:rPr>
         <w:t xml:space="preserve"> · </w:t>
       </w:r>
-      <w:hyperlink w:history="1" r:id="rIdkdaot18r1-0f6l-ajgrej">
+      <w:hyperlink w:history="1" r:id="rIddymg84hfzaufh5kpo1nce">
         <w:r>
           <w:rPr>
             <w:color w:val="1A4EA3"/>
@@ -1378,7 +1515,7 @@
             <w:szCs w:val="19"/>
             <w:u w:val="single"/>
           </w:rPr>
-          <w:t xml:space="preserve">pawacloud-web.fly.dev</w:t>
+          <w:t xml:space="preserve">pesacore-web-261341881894.africa-south1.run.app</w:t>
         </w:r>
       </w:hyperlink>
     </w:p>
@@ -1391,7 +1528,7 @@
           <w:sz w:val="19"/>
           <w:szCs w:val="19"/>
         </w:rPr>
-        <w:t xml:space="preserve">AI chatbot with Gemini 2.5 Flash, Rust+PyO3 text processing, SSE streaming, Google OAuth, and PostgreSQL persistence on GCP Cloud Run</w:t>
+        <w:t xml:space="preserve">Live core-banking platform: ASP.NET Core 10 API + Blazor WebAssembly console (BFF) — CQRS with idempotent transfers, real Neon Postgres persistence, distributed Upstash Redis cache, OpenTelemetry, ReDoc — deployed serverless on GCP Cloud Run (scale-to-zero) and portable to on-prem Windows/IIS.</w:t>
       </w:r>
     </w:p>
     <w:p>
@@ -1404,7 +1541,7 @@
           <w:sz w:val="17"/>
           <w:szCs w:val="17"/>
         </w:rPr>
-        <w:t xml:space="preserve">Python · FastAPI · Rust · PyO3 · Gemini AI · Next.js · TailwindCSS · PostgreSQL · Google Cloud · Cloud Run</w:t>
+        <w:t xml:space="preserve">C# · .NET 10 · ASP.NET Core · Clean Architecture · MediatR · CQRS · Polly · FluentValidation · Entity Framework Core · AutoMapper</w:t>
       </w:r>
     </w:p>
     <w:p>
@@ -1418,6 +1555,177 @@
           <w:sz w:val="21"/>
           <w:szCs w:val="21"/>
         </w:rPr>
+        <w:t xml:space="preserve">AgentPlane — AI-Powered JIRA Board</w:t>
+      </w:r>
+      <w:r>
+        <w:rPr>
+          <w:sz w:val="19"/>
+          <w:szCs w:val="19"/>
+        </w:rPr>
+        <w:t xml:space="preserve"> · </w:t>
+      </w:r>
+      <w:hyperlink w:history="1" r:id="rId8gh003ykbdsaccdf4hzrm">
+        <w:r>
+          <w:rPr>
+            <w:color w:val="1A4EA3"/>
+            <w:sz w:val="19"/>
+            <w:szCs w:val="19"/>
+            <w:u w:val="single"/>
+          </w:rPr>
+          <w:t xml:space="preserve">agent-plane.ericgitangu.com</w:t>
+        </w:r>
+      </w:hyperlink>
+    </w:p>
+    <w:p>
+      <w:pPr>
+        <w:spacing w:after="60"/>
+      </w:pPr>
+      <w:r>
+        <w:rPr>
+          <w:sz w:val="19"/>
+          <w:szCs w:val="19"/>
+        </w:rPr>
+        <w:t xml:space="preserve">Full-stack AI project management tool — describe an epic in natural language and a LangGraph multi-agent pipeline (Decomposer → Estimator → Assigner) breaks it into estimated, assigned sub-issues streamed back via SSE onto a Plane-style Kanban board.</w:t>
+      </w:r>
+    </w:p>
+    <w:p>
+      <w:pPr>
+        <w:spacing w:after="60"/>
+      </w:pPr>
+      <w:r>
+        <w:rPr>
+          <w:color w:val="1A4EA3"/>
+          <w:sz w:val="17"/>
+          <w:szCs w:val="17"/>
+        </w:rPr>
+        <w:t xml:space="preserve">Python 3.12 · FastAPI · LangGraph · LangChain · Anthropic · Next.js 14 · TypeScript · TanStack Query · CockroachDB · MongoDB Atlas</w:t>
+      </w:r>
+    </w:p>
+    <w:p>
+      <w:pPr>
+        <w:spacing w:before="80" w:after="20"/>
+      </w:pPr>
+      <w:r>
+        <w:rPr>
+          <w:b/>
+          <w:bCs/>
+          <w:sz w:val="21"/>
+          <w:szCs w:val="21"/>
+        </w:rPr>
+        <w:t xml:space="preserve">SwarmBench Multi-Agent LLM Empirical Study</w:t>
+      </w:r>
+      <w:r>
+        <w:rPr>
+          <w:sz w:val="19"/>
+          <w:szCs w:val="19"/>
+        </w:rPr>
+        <w:t xml:space="preserve"> · </w:t>
+      </w:r>
+      <w:hyperlink w:history="1" r:id="rId6hyw-pjg8tkw8xd-pxy3j">
+        <w:r>
+          <w:rPr>
+            <w:color w:val="1A4EA3"/>
+            <w:sz w:val="19"/>
+            <w:szCs w:val="19"/>
+            <w:u w:val="single"/>
+          </w:rPr>
+          <w:t xml:space="preserve">developer.ericgitangu.com/pdf/research-paper.pdf</w:t>
+        </w:r>
+      </w:hyperlink>
+    </w:p>
+    <w:p>
+      <w:pPr>
+        <w:spacing w:after="60"/>
+      </w:pPr>
+      <w:r>
+        <w:rPr>
+          <w:sz w:val="19"/>
+          <w:szCs w:val="19"/>
+        </w:rPr>
+        <w:t xml:space="preserve">Seven-trial benchmark engineering study on Kimi K2.5 falsifying three multi-agent advantage hypotheses; produced a 15-page scholarly preprint.</w:t>
+      </w:r>
+    </w:p>
+    <w:p>
+      <w:pPr>
+        <w:spacing w:after="60"/>
+      </w:pPr>
+      <w:r>
+        <w:rPr>
+          <w:color w:val="1A4EA3"/>
+          <w:sz w:val="17"/>
+          <w:szCs w:val="17"/>
+        </w:rPr>
+        <w:t xml:space="preserve">Kimi K2.5 · Fireworks AI · Harbor · Docker · Python · pandoc · WeasyPrint · LLM-as-judge · Multi-Agent Systems · Benchmark Design</w:t>
+      </w:r>
+    </w:p>
+    <w:p>
+      <w:pPr>
+        <w:spacing w:before="80" w:after="20"/>
+      </w:pPr>
+      <w:r>
+        <w:rPr>
+          <w:b/>
+          <w:bCs/>
+          <w:sz w:val="21"/>
+          <w:szCs w:val="21"/>
+        </w:rPr>
+        <w:t xml:space="preserve">PawaCloud Assistant — AI Cloud Advisor</w:t>
+      </w:r>
+      <w:r>
+        <w:rPr>
+          <w:sz w:val="19"/>
+          <w:szCs w:val="19"/>
+        </w:rPr>
+        <w:t xml:space="preserve"> · </w:t>
+      </w:r>
+      <w:hyperlink w:history="1" r:id="rIdpjmz6wnpisbt4_qs9asz_">
+        <w:r>
+          <w:rPr>
+            <w:color w:val="1A4EA3"/>
+            <w:sz w:val="19"/>
+            <w:szCs w:val="19"/>
+            <w:u w:val="single"/>
+          </w:rPr>
+          <w:t xml:space="preserve">pawacloud-web.vercel.app</w:t>
+        </w:r>
+      </w:hyperlink>
+    </w:p>
+    <w:p>
+      <w:pPr>
+        <w:spacing w:after="60"/>
+      </w:pPr>
+      <w:r>
+        <w:rPr>
+          <w:sz w:val="19"/>
+          <w:szCs w:val="19"/>
+        </w:rPr>
+        <w:t xml:space="preserve">AI chatbot with Gemini 2.5 Flash, Rust+PyO3 text processing, SSE streaming, Google OAuth, and PostgreSQL persistence on GCP Cloud Run</w:t>
+      </w:r>
+    </w:p>
+    <w:p>
+      <w:pPr>
+        <w:spacing w:after="60"/>
+      </w:pPr>
+      <w:r>
+        <w:rPr>
+          <w:color w:val="1A4EA3"/>
+          <w:sz w:val="17"/>
+          <w:szCs w:val="17"/>
+        </w:rPr>
+        <w:t xml:space="preserve">Python · FastAPI · Rust · PyO3 · Gemini AI · Next.js · TailwindCSS · PostgreSQL · Google Cloud · Cloud Run</w:t>
+      </w:r>
+    </w:p>
+    <w:p>
+      <w:pPr>
+        <w:spacing w:before="80" w:after="20"/>
+      </w:pPr>
+      <w:r>
+        <w:rPr>
+          <w:b/>
+          <w:bCs/>
+          <w:sz w:val="21"/>
+          <w:szCs w:val="21"/>
+        </w:rPr>
         <w:t xml:space="preserve">UniRides — Ride-Sharing Reimagined</w:t>
       </w:r>
       <w:r>
@@ -1427,7 +1735,7 @@
         </w:rPr>
         <w:t xml:space="preserve"> · </w:t>
       </w:r>
-      <w:hyperlink w:history="1" r:id="rIdrhs_epv-o555widdqsemb">
+      <w:hyperlink w:history="1" r:id="rId10l4liemrx6vcj70nmywi">
         <w:r>
           <w:rPr>
             <w:color w:val="1A4EA3"/>
@@ -1484,7 +1792,7 @@
         </w:rPr>
         <w:t xml:space="preserve"> · </w:t>
       </w:r>
-      <w:hyperlink w:history="1" r:id="rIduypckwua3ia62gvkysktb">
+      <w:hyperlink w:history="1" r:id="rIdrn_m7puxj_yn_ckcewyds">
         <w:r>
           <w:rPr>
             <w:color w:val="1A4EA3"/>
@@ -1541,7 +1849,7 @@
         </w:rPr>
         <w:t xml:space="preserve"> · </w:t>
       </w:r>
-      <w:hyperlink w:history="1" r:id="rIddnqonltgw1ovuuuhh8ipi">
+      <w:hyperlink w:history="1" r:id="rIdlxfwlk08kmohw6yuux3fg">
         <w:r>
           <w:rPr>
             <w:color w:val="1A4EA3"/>
@@ -1598,7 +1906,7 @@
         </w:rPr>
         <w:t xml:space="preserve"> · </w:t>
       </w:r>
-      <w:hyperlink w:history="1" r:id="rIdroqgi9dpwtyvarsqcn0ls">
+      <w:hyperlink w:history="1" r:id="rIdutd0t8befj-xbbsgpxrh0">
         <w:r>
           <w:rPr>
             <w:color w:val="1A4EA3"/>
@@ -1633,177 +1941,6 @@
           <w:szCs w:val="17"/>
         </w:rPr>
         <w:t xml:space="preserve">Next.js · Rust · Python · AWS CDK · Bedrock · SageMaker · Upstash Redis · Fly.io · TypeScript</w:t>
-      </w:r>
-    </w:p>
-    <w:p>
-      <w:pPr>
-        <w:spacing w:before="80" w:after="20"/>
-      </w:pPr>
-      <w:r>
-        <w:rPr>
-          <w:b/>
-          <w:bCs/>
-          <w:sz w:val="21"/>
-          <w:szCs w:val="21"/>
-        </w:rPr>
-        <w:t xml:space="preserve">Secure Messenger Desktop</w:t>
-      </w:r>
-      <w:r>
-        <w:rPr>
-          <w:sz w:val="19"/>
-          <w:szCs w:val="19"/>
-        </w:rPr>
-        <w:t xml:space="preserve"> · </w:t>
-      </w:r>
-      <w:hyperlink w:history="1" r:id="rId6idqov5h2wiyfklnqxmkd">
-        <w:r>
-          <w:rPr>
-            <w:color w:val="1A4EA3"/>
-            <w:sz w:val="19"/>
-            <w:szCs w:val="19"/>
-            <w:u w:val="single"/>
-          </w:rPr>
-          <w:t xml:space="preserve">secure-messenger-desktop.fly.dev</w:t>
-        </w:r>
-      </w:hyperlink>
-    </w:p>
-    <w:p>
-      <w:pPr>
-        <w:spacing w:after="60"/>
-      </w:pPr>
-      <w:r>
-        <w:rPr>
-          <w:sz w:val="19"/>
-          <w:szCs w:val="19"/>
-        </w:rPr>
-        <w:t xml:space="preserve">Electron + React + TypeScript secure messenger with real-time WebSocket sync, AES-256-GCM encryption, SQLite storage, and Prometheus/Grafana observability</w:t>
-      </w:r>
-    </w:p>
-    <w:p>
-      <w:pPr>
-        <w:spacing w:after="60"/>
-      </w:pPr>
-      <w:r>
-        <w:rPr>
-          <w:color w:val="1A4EA3"/>
-          <w:sz w:val="17"/>
-          <w:szCs w:val="17"/>
-        </w:rPr>
-        <w:t xml:space="preserve">Electron · React · TypeScript · SQLite · Redux Toolkit · WebSocket · AES-256-GCM · Prometheus · Fly.io</w:t>
-      </w:r>
-    </w:p>
-    <w:p>
-      <w:pPr>
-        <w:spacing w:before="80" w:after="20"/>
-      </w:pPr>
-      <w:r>
-        <w:rPr>
-          <w:b/>
-          <w:bCs/>
-          <w:sz w:val="21"/>
-          <w:szCs w:val="21"/>
-        </w:rPr>
-        <w:t xml:space="preserve">UniCorns - Multi-Tenant SaaS Super-App</w:t>
-      </w:r>
-      <w:r>
-        <w:rPr>
-          <w:sz w:val="19"/>
-          <w:szCs w:val="19"/>
-        </w:rPr>
-        <w:t xml:space="preserve"> · </w:t>
-      </w:r>
-      <w:hyperlink w:history="1" r:id="rIdg8rhp4bvhst8ovnngteyi">
-        <w:r>
-          <w:rPr>
-            <w:color w:val="1A4EA3"/>
-            <w:sz w:val="19"/>
-            <w:szCs w:val="19"/>
-            <w:u w:val="single"/>
-          </w:rPr>
-          <w:t xml:space="preserve">unicorns.ericgitangu.com</w:t>
-        </w:r>
-      </w:hyperlink>
-    </w:p>
-    <w:p>
-      <w:pPr>
-        <w:spacing w:after="60"/>
-      </w:pPr>
-      <w:r>
-        <w:rPr>
-          <w:sz w:val="19"/>
-          <w:szCs w:val="19"/>
-        </w:rPr>
-        <w:t xml:space="preserve">Comprehensive multi-tenant business platform for African SMBs with 5 Rust microservices, healthcare EMR, M-Pesa payments, and AI features</w:t>
-      </w:r>
-    </w:p>
-    <w:p>
-      <w:pPr>
-        <w:spacing w:after="60"/>
-      </w:pPr>
-      <w:r>
-        <w:rPr>
-          <w:color w:val="1A4EA3"/>
-          <w:sz w:val="17"/>
-          <w:szCs w:val="17"/>
-        </w:rPr>
-        <w:t xml:space="preserve">Rust · AWS Lambda · DynamoDB · Next.js · Kotlin · Claude AI · M-Pesa</w:t>
-      </w:r>
-    </w:p>
-    <w:p>
-      <w:pPr>
-        <w:spacing w:before="80" w:after="20"/>
-      </w:pPr>
-      <w:r>
-        <w:rPr>
-          <w:b/>
-          <w:bCs/>
-          <w:sz w:val="21"/>
-          <w:szCs w:val="21"/>
-        </w:rPr>
-        <w:t xml:space="preserve">Interactive Resume with AI Chatbot</w:t>
-      </w:r>
-      <w:r>
-        <w:rPr>
-          <w:sz w:val="19"/>
-          <w:szCs w:val="19"/>
-        </w:rPr>
-        <w:t xml:space="preserve"> · </w:t>
-      </w:r>
-      <w:hyperlink w:history="1" r:id="rIdx8aoqzvzceaa8wifnri34">
-        <w:r>
-          <w:rPr>
-            <w:color w:val="1A4EA3"/>
-            <w:sz w:val="19"/>
-            <w:szCs w:val="19"/>
-            <w:u w:val="single"/>
-          </w:rPr>
-          <w:t xml:space="preserve">resume.ericgitangu.com</w:t>
-        </w:r>
-      </w:hyperlink>
-    </w:p>
-    <w:p>
-      <w:pPr>
-        <w:spacing w:after="60"/>
-      </w:pPr>
-      <w:r>
-        <w:rPr>
-          <w:sz w:val="19"/>
-          <w:szCs w:val="19"/>
-        </w:rPr>
-        <w:t xml:space="preserve">Modern interactive resume with AI-powered chatbot, career visualizations, and downloadable formats</w:t>
-      </w:r>
-    </w:p>
-    <w:p>
-      <w:pPr>
-        <w:spacing w:after="60"/>
-      </w:pPr>
-      <w:r>
-        <w:rPr>
-          <w:color w:val="1A4EA3"/>
-          <w:sz w:val="17"/>
-          <w:szCs w:val="17"/>
-        </w:rPr>
-        <w:t xml:space="preserve">Next.js · TypeScript · AI/LLM · Recharts · Tailwind CSS · Fly.io</w:t>
       </w:r>
     </w:p>
     <w:p>

</xml_diff>